<commit_message>
P11.01: synchronize C48 specification authorities
</commit_message>
<xml_diff>
--- a/docs/04-C48 Language Specification Rev 0.11.docx
+++ b/docs/04-C48 Language Specification Rev 0.11.docx
@@ -139,15 +139,15 @@
         <w:pStyle w:val="BodyText"/>
       </w:pPr>
       <w:r>
-        <w:t>Architecture authority: v1/docs/01-ZX-UX-ARCHITECTURE-REV11.md</w:t>
-      </w:r>
-    </w:p>
-    <w:p>
-      <w:pPr>
-        <w:pStyle w:val="BodyText"/>
-      </w:pPr>
-      <w:r>
-        <w:t>Implementation-plan authority: v1/docs/02-ZX-UX-IMPLEMENTATION-STEPS-REV02.md</w:t>
+        <w:t>Architecture authority: v1/docs/01-ZX-UX-ARCHITECTURE-REV17.md</w:t>
+      </w:r>
+    </w:p>
+    <w:p>
+      <w:pPr>
+        <w:pStyle w:val="BodyText"/>
+      </w:pPr>
+      <w:r>
+        <w:t>Implementation-plan authority: v1/docs/02-ZX-UX-IMPLEMENTATION-STEPS-REV08.md</w:t>
       </w:r>
     </w:p>
     <w:p>
@@ -268,23 +268,23 @@
         <w:pStyle w:val="FirstParagraph"/>
       </w:pPr>
       <w:r>
-        <w:t>This document supplements architectural areas that Revision 11 intentionally or accidentally leaves underspecified.</w:t>
-      </w:r>
-    </w:p>
-    <w:p>
-      <w:pPr>
-        <w:pStyle w:val="BodyText"/>
-      </w:pPr>
-      <w:r>
-        <w:t>It MUST NOT override an explicit Revision-11 requirement.</w:t>
-      </w:r>
-    </w:p>
-    <w:p>
-      <w:pPr>
-        <w:pStyle w:val="BodyText"/>
-      </w:pPr>
-      <w:r>
-        <w:t>If any statement in this document conflicts with Revision 11, Revision 11 wins and the conflict MUST be reported rather than silently reconciled by the developer.</w:t>
+        <w:t>This document supplements architectural areas that Revision 17 intentionally or accidentally leaves underspecified.</w:t>
+      </w:r>
+    </w:p>
+    <w:p>
+      <w:pPr>
+        <w:pStyle w:val="BodyText"/>
+      </w:pPr>
+      <w:r>
+        <w:t>It MUST NOT override an explicit Revision-17 requirement.</w:t>
+      </w:r>
+    </w:p>
+    <w:p>
+      <w:pPr>
+        <w:pStyle w:val="BodyText"/>
+      </w:pPr>
+      <w:r>
+        <w:t>If any statement in this document conflicts with Revision 17, Revision 17 wins and the conflict MUST be reported rather than silently reconciled by the developer.</w:t>
       </w:r>
     </w:p>
     <w:p>
@@ -2585,7 +2585,7 @@
         <w:pStyle w:val="FirstParagraph"/>
       </w:pPr>
       <w:r>
-        <w:t>Every C48 floating value uses the Spectrum-ROM-compatible five-byte numeric representation frozen by Revision 11.</w:t>
+        <w:t>Every C48 floating value uses the Spectrum-ROM-compatible five-byte numeric representation frozen by Revision 17.</w:t>
       </w:r>
     </w:p>
     <w:p>
@@ -5919,7 +5919,7 @@
         <w:pStyle w:val="BodyText"/>
       </w:pPr>
       <w:r>
-        <w:t>These promotions do NOT erase the architecture-defined 8-bit shift case. For `&lt;&lt;` and `&gt;&gt;`, Section 46 deliberately uses the unpromoted left operand type and width. This C48-specific exception is required so an 8-bit `char`/`unsigned char` shift uses the low three bits of the count exactly as Revision 11 requires.</w:t>
+        <w:t>These promotions do NOT erase the architecture-defined 8-bit shift case. For `&lt;&lt;` and `&gt;&gt;`, Section 46 deliberately uses the unpromoted left operand type and width. This C48-specific exception is required so an 8-bit `char`/`unsigned char` shift uses the low three bits of the count exactly as Revision 17 requires.</w:t>
       </w:r>
     </w:p>
     <w:p>
@@ -8601,7 +8601,7 @@
         <w:pStyle w:val="BodyText"/>
       </w:pPr>
       <w:r>
-        <w:t>The name is exact and case-sensitive, is 1..10 portable namespace characters, and obeys the Revision-11 object-name grammar `A-Z a-z 0-9 _ - .`, excluding exact `.` and `..`. It resolves only in the current ZX-UX directory; PATH and system-header searching do not apply.</w:t>
+        <w:t>The name is exact and case-sensitive, is 1..10 portable namespace characters, and obeys the Revision-17 object-name grammar `A-Z a-z 0-9 _ - .`, excluding exact `.` and `..`. It resolves only in the current ZX-UX directory; PATH and system-header searching do not apply.</w:t>
       </w:r>
     </w:p>
     <w:p>
@@ -8682,7 +8682,7 @@
         <w:pStyle w:val="BodyText"/>
       </w:pPr>
       <w:r>
-        <w:t>P11.01 freezes that this header ultimately exposes the complete Revision-11 Section-25.8 public runtime name set. Exact C48 prototypes, parameter types, constants, errno/flag constants, and supporting declaration records are frozen by P11.41 after their owning runtime ABI steps. P11.01 MUST NOT fabricate missing signatures.</w:t>
+        <w:t>P11.01 freezes that this header ultimately exposes the complete Revision-17 Section-25.8 public runtime name set. Exact C48 prototypes, parameter types, constants, errno/flag constants, and supporting declaration records are frozen by P11.41 after their owning runtime ABI steps. P11.01 MUST NOT fabricate missing signatures.</w:t>
       </w:r>
     </w:p>
     <w:p>
@@ -9167,7 +9167,7 @@
         <w:pStyle w:val="BodyText"/>
       </w:pPr>
       <w:r>
-        <w:t>P11.02 MUST freeze exact bounded capacities for globals/externs, locals, compiler-generated labels, expression trees, type/declarator representation, macro tables, include buffering, literal storage, and every other bounded compiler table from the Revision-11 &lt;=20 KiB compiler residency budget.</w:t>
+        <w:t>P11.02 MUST freeze exact bounded capacities for globals/externs, locals, compiler-generated labels, expression trees, type/declarator representation, macro tables, include buffering, literal storage, and every other bounded compiler table from the Revision-17 &lt;=20 KiB compiler residency budget.</w:t>
       </w:r>
     </w:p>
     <w:p>
@@ -9202,7 +9202,7 @@
       <w:bookmarkStart w:id="80" w:name="output-model"/>
       <w:bookmarkEnd w:id="79"/>
       <w:r>
-        <w:t>The complete front-end/backend flow, reconciling REV11 Section 25.5 with REV02 P11.03, is:</w:t>
+        <w:t>The complete front-end/backend flow, reconciling REV17 Section 25.5 with REV08 P11.03, is:</w:t>
       </w:r>
     </w:p>
     <w:p>
@@ -9277,7 +9277,7 @@
         <w:pStyle w:val="BodyText"/>
       </w:pPr>
       <w:r>
-        <w:t>Default `cc hello.c` requires the exact lower-case final `.c`, removes only that suffix, and appends `.obj`; the derived name must fit the exact 10-byte ZX-UX namespace limit. Otherwise the explicit form is `cc -o out.obj source`, with an exact case-sensitive &lt;=10-byte destination. In both forms, source and destination paths obey the Revision-11 ZX-UX path contract: normalization is performed before comparison or access; the normalized path is at most 31 bytes excluding the terminating NUL; each ordinary object basename is 1..10 portable name characters `A-Z a-z 0-9 _ - .`, with exact `.` and `..` reserved; and lookup is case-sensitive. Overlength normalized paths are rejected through the normal ZX-UX path/errno contract rather than truncated.</w:t>
+        <w:t>Default `cc hello.c` requires the exact lower-case final `.c`, removes only that suffix, and appends `.obj`; the derived name must fit the exact 10-byte ZX-UX namespace limit. Otherwise the explicit form is `cc -o out.obj source`, with an exact case-sensitive &lt;=10-byte destination. In both forms, source and destination paths obey the Revision-17 ZX-UX path contract: normalization is performed before comparison or access; the normalized path is at most 31 bytes excluding the terminating NUL; each ordinary object basename is 1..10 portable name characters `A-Z a-z 0-9 _ - .`, with exact `.` and `..` reserved; and lookup is case-sensitive. Overlength normalized paths are rejected through the normal ZX-UX path/errno contract rather than truncated.</w:t>
       </w:r>
     </w:p>
     <w:p>
@@ -11114,15 +11114,15 @@
         <w:pStyle w:val="BodyText"/>
       </w:pPr>
       <w:r>
-        <w:t>The exact architectural declaration `int beep(float duration, float pitch)` remains frozen because REV11 already specifies it.</w:t>
-      </w:r>
-    </w:p>
-    <w:p>
-      <w:pPr>
-        <w:pStyle w:val="BodyText"/>
-      </w:pPr>
-      <w:r>
-        <w:t>REV11 also shows the explanatory floating bridge notation:</w:t>
+        <w:t>The exact architectural declaration `int beep(float duration, float pitch)` remains frozen because REV17 already specifies it.</w:t>
+      </w:r>
+    </w:p>
+    <w:p>
+      <w:pPr>
+        <w:pStyle w:val="BodyText"/>
+      </w:pPr>
+      <w:r>
+        <w:t>REV17 also shows the explanatory floating bridge notation:</w:t>
       </w:r>
     </w:p>
     <w:p>
@@ -11166,7 +11166,7 @@
       <w:bookmarkStart w:id="99" w:name="no-silent-architecture-extrapolation"/>
       <w:bookmarkEnd w:id="98"/>
       <w:r>
-        <w:t>Revision-11 ABI prose may use modern C-like `const float *` notation to communicate read-only buffers. C48 Version 1 itself does not support the `const` qualifier.</w:t>
+        <w:t>Revision-17 ABI prose may use modern C-like `const float *` notation to communicate read-only buffers. C48 Version 1 itself does not support the `const` qualifier.</w:t>
       </w:r>
     </w:p>
     <w:p>
@@ -11211,7 +11211,7 @@
         </w:numPr>
       </w:pPr>
       <w:r>
-        <w:t>Revision 11;</w:t>
+        <w:t>Revision 17;</w:t>
       </w:r>
     </w:p>
     <w:p>
@@ -11223,7 +11223,7 @@
         </w:numPr>
       </w:pPr>
       <w:r>
-        <w:t>Revision 02;</w:t>
+        <w:t>Revision 08;</w:t>
       </w:r>
     </w:p>
     <w:p>
@@ -11650,7 +11650,7 @@
         <w:pStyle w:val="FirstParagraph"/>
       </w:pPr>
       <w:r>
-        <w:t>No item above may be left to implementation inference. Internal code-generation choices may remain implementation decisions only where REV11/REV02 deliberately leave multiple semantically equivalent implementations available.</w:t>
+        <w:t>No item above may be left to implementation inference. Internal code-generation choices may remain implementation decisions only where REV17/REV08 deliberately leave multiple semantically equivalent implementations available.</w:t>
       </w:r>
     </w:p>
     <w:p/>
@@ -11677,7 +11677,7 @@
         <w:pStyle w:val="BodyText"/>
       </w:pPr>
       <w:r>
-        <w:t>Each fresh scan MUST independently cover the canonical REV11/REV02 language requirements and at least the following dimensions:</w:t>
+        <w:t>Each fresh scan MUST independently cover the canonical REV17/REV08 language requirements and at least the following dimensions:</w:t>
       </w:r>
     </w:p>
     <w:p>
@@ -11685,15 +11685,15 @@
         <w:pStyle w:val="SourceCode"/>
       </w:pPr>
       <w:r>
-        <w:t>zero contradictions with explicit REV11 rules</w:t>
-      </w:r>
-      <w:r>
-        <w:br/>
-        <w:t>zero supported REV11 language features omitted</w:t>
-      </w:r>
-      <w:r>
-        <w:br/>
-        <w:t>zero REV11-deferred features accidentally enabled</w:t>
+        <w:t>zero contradictions with explicit REV17 rules</w:t>
+      </w:r>
+      <w:r>
+        <w:br/>
+        <w:t>zero supported REV17 language features omitted</w:t>
+      </w:r>
+      <w:r>
+        <w:br/>
+        <w:t>zero REV17-deferred features accidentally enabled</w:t>
       </w:r>
       <w:r>
         <w:br/>
@@ -12177,7 +12177,7 @@
         <w:pStyle w:val="FirstParagraph"/>
       </w:pPr>
       <w:r>
-        <w:t xml:space="preserve">The developer implementing P11.01 is to treat this document as specification input, reconcile it mechanically against the canonical on-disk REV11 and REV02 documents, and produce </w:t>
+        <w:t xml:space="preserve">The developer implementing P11.01 is to treat this document as specification input, reconcile it mechanically against the canonical on-disk REV17 and REV08 documents, and produce </w:t>
       </w:r>
       <w:r>
         <w:rPr>
@@ -12866,7 +12866,7 @@
         <w:pStyle w:val="FirstParagraph"/>
       </w:pPr>
       <w:r>
-        <w:t>P11.41 owns the exact built-in declaration table. The following Revision-11 Section-25.8 names are mandatory and MUST all be represented when P11.41 freezes `&lt;c48.h&gt;`; this appendix does not invent their not-yet-frozen prototypes.</w:t>
+        <w:t>P11.41 owns the exact built-in declaration table. The following Revision-17 Section-25.8 names are mandatory and MUST all be represented when P11.41 freezes `&lt;c48.h&gt;`; this appendix does not invent their not-yet-frozen prototypes.</w:t>
       </w:r>
     </w:p>
     <w:p>
@@ -13194,7 +13194,7 @@
         <w:pStyle w:val="FirstParagraph"/>
       </w:pPr>
       <w:r>
-        <w:t>`printf` is not part of the mandatory Version-1 public surface. REV11 instead requires a compact integer formatter and small ROM-backed floating formatter without authorizing a large general-purpose `printf`.</w:t>
+        <w:t>`printf` is not part of the mandatory Version-1 public surface. REV17 instead requires a compact integer formatter and small ROM-backed floating formatter without authorizing a large general-purpose `printf`.</w:t>
       </w:r>
     </w:p>
     <w:p>

</xml_diff>